<commit_message>
PS: twelve months → a year for Apple tenure
Co-Authored-By: Claude Sonnet 4.6 <noreply@anthropic.com>
</commit_message>
<xml_diff>
--- a/application/cccw_personal_statement.docx
+++ b/application/cccw_personal_statement.docx
@@ -55,7 +55,7 @@
         <w:t xml:space="preserve"> </w:t>
       </w:r>
       <w:r>
-        <w:t xml:space="preserve">empirical work on Chinese governance — and twelve months of production-grade AI</w:t>
+        <w:t xml:space="preserve">empirical work on Chinese governance — and a year of production-grade AI</w:t>
       </w:r>
       <w:r>
         <w:t xml:space="preserve"> </w:t>
@@ -466,7 +466,7 @@
         <w:t xml:space="preserve"> </w:t>
       </w:r>
       <w:r>
-        <w:t xml:space="preserve">documents and organizational records. I spent twelve months at Apple’s Intelligence</w:t>
+        <w:t xml:space="preserve">documents and organizational records. I spent a year at Apple’s Intelligence</w:t>
       </w:r>
       <w:r>
         <w:t xml:space="preserve"> </w:t>

</xml_diff>

<commit_message>
PS: multiple factual corrections and new database paragraph
- "the first study" → "among the first studies" (safer claim)
- "a year" → "almost a year" for Apple tenure
- Remove specific journal targets from working papers (not under review)
- Add paragraph on databases built under Prof. Xiulan Zhang's supervision:
  multi-actor coordination DB (2010-2023) and social organization DB (2000+ orgs)

Co-Authored-By: Claude Sonnet 4.6 <noreply@anthropic.com>
</commit_message>
<xml_diff>
--- a/application/cccw_personal_statement.docx
+++ b/application/cccw_personal_statement.docx
@@ -55,7 +55,7 @@
         <w:t xml:space="preserve"> </w:t>
       </w:r>
       <w:r>
-        <w:t xml:space="preserve">empirical work on Chinese governance — and a year of production-grade AI</w:t>
+        <w:t xml:space="preserve">empirical work on Chinese governance — and almost a year of production-grade AI</w:t>
       </w:r>
       <w:r>
         <w:t xml:space="preserve"> </w:t>
@@ -197,7 +197,7 @@
         <w:t xml:space="preserve"> </w:t>
       </w:r>
       <w:r>
-        <w:t xml:space="preserve">over a multi-year horizon. This is the first study to apply forward-looking vulnerability measurement to</w:t>
+        <w:t xml:space="preserve">over a multi-year horizon. This is among the first studies to apply forward-looking vulnerability measurement to</w:t>
       </w:r>
       <w:r>
         <w:t xml:space="preserve"> </w:t>
@@ -223,90 +223,150 @@
         <w:t xml:space="preserve"> </w:t>
       </w:r>
       <w:r>
-        <w:t xml:space="preserve">currently under revision for submission to</w:t>
-      </w:r>
-      <w:r>
-        <w:t xml:space="preserve"> </w:t>
-      </w:r>
-      <w:r>
-        <w:rPr>
-          <w:i/>
-          <w:iCs/>
-        </w:rPr>
-        <w:t xml:space="preserve">Journal of Chinese Governance</w:t>
-      </w:r>
-      <w:r>
-        <w:t xml:space="preserve">, that</w:t>
-      </w:r>
-      <w:r>
-        <w:t xml:space="preserve"> </w:t>
-      </w:r>
-      <w:r>
-        <w:t xml:space="preserve">examines the organizational ecology of China’s poverty alleviation governance and</w:t>
-      </w:r>
-      <w:r>
-        <w:t xml:space="preserve"> </w:t>
-      </w:r>
-      <w:r>
-        <w:t xml:space="preserve">proposes the concept of a</w:t>
-      </w:r>
-      <w:r>
-        <w:t xml:space="preserve"> </w:t>
-      </w:r>
-      <w:r>
-        <w:t xml:space="preserve">“development governance knowledge system”</w:t>
-      </w:r>
-      <w:r>
-        <w:t xml:space="preserve">: a distinctive</w:t>
-      </w:r>
-      <w:r>
-        <w:t xml:space="preserve"> </w:t>
-      </w:r>
-      <w:r>
-        <w:t xml:space="preserve">model of state-led multi-actor coordination — integrating government agencies,</w:t>
-      </w:r>
-      <w:r>
-        <w:t xml:space="preserve"> </w:t>
-      </w:r>
-      <w:r>
-        <w:t xml:space="preserve">universities, enterprises, and financial institutions — that departs structurally</w:t>
-      </w:r>
-      <w:r>
-        <w:t xml:space="preserve"> </w:t>
-      </w:r>
-      <w:r>
-        <w:t xml:space="preserve">from the NGO-driven, donor-dependent frameworks dominant in international</w:t>
-      </w:r>
-      <w:r>
-        <w:t xml:space="preserve"> </w:t>
-      </w:r>
-      <w:r>
-        <w:t xml:space="preserve">development research. A second working paper, in preparation for</w:t>
-      </w:r>
-      <w:r>
-        <w:t xml:space="preserve"> </w:t>
-      </w:r>
-      <w:r>
-        <w:rPr>
-          <w:i/>
-          <w:iCs/>
-        </w:rPr>
-        <w:t xml:space="preserve">China Quarterly</w:t>
-      </w:r>
-      <w:r>
-        <w:t xml:space="preserve">,</w:t>
-      </w:r>
-      <w:r>
-        <w:t xml:space="preserve"> </w:t>
-      </w:r>
-      <w:r>
-        <w:t xml:space="preserve">extends this framework through text-as-data methods, developing a replicable</w:t>
-      </w:r>
-      <w:r>
-        <w:t xml:space="preserve"> </w:t>
-      </w:r>
-      <w:r>
-        <w:t xml:space="preserve">pipeline for computational analysis of Chinese governance documents at scale.</w:t>
+        <w:t xml:space="preserve">currently in preparation, that examines the organizational ecology of China’s</w:t>
+      </w:r>
+      <w:r>
+        <w:t xml:space="preserve"> </w:t>
+      </w:r>
+      <w:r>
+        <w:t xml:space="preserve">poverty alleviation governance and proposes the concept of a</w:t>
+      </w:r>
+      <w:r>
+        <w:t xml:space="preserve"> </w:t>
+      </w:r>
+      <w:r>
+        <w:t xml:space="preserve">“development</w:t>
+      </w:r>
+      <w:r>
+        <w:t xml:space="preserve"> </w:t>
+      </w:r>
+      <w:r>
+        <w:t xml:space="preserve">governance knowledge system”</w:t>
+      </w:r>
+      <w:r>
+        <w:t xml:space="preserve">: a distinctive model of state-led multi-actor</w:t>
+      </w:r>
+      <w:r>
+        <w:t xml:space="preserve"> </w:t>
+      </w:r>
+      <w:r>
+        <w:t xml:space="preserve">coordination — integrating government agencies, universities, enterprises, and</w:t>
+      </w:r>
+      <w:r>
+        <w:t xml:space="preserve"> </w:t>
+      </w:r>
+      <w:r>
+        <w:t xml:space="preserve">financial institutions — that departs structurally from the NGO-driven,</w:t>
+      </w:r>
+      <w:r>
+        <w:t xml:space="preserve"> </w:t>
+      </w:r>
+      <w:r>
+        <w:t xml:space="preserve">donor-dependent frameworks dominant in international development research. A</w:t>
+      </w:r>
+      <w:r>
+        <w:t xml:space="preserve"> </w:t>
+      </w:r>
+      <w:r>
+        <w:t xml:space="preserve">second working paper extends this framework through text-as-data methods,</w:t>
+      </w:r>
+      <w:r>
+        <w:t xml:space="preserve"> </w:t>
+      </w:r>
+      <w:r>
+        <w:t xml:space="preserve">developing a replicable pipeline for computational analysis of Chinese governance</w:t>
+      </w:r>
+      <w:r>
+        <w:t xml:space="preserve"> </w:t>
+      </w:r>
+      <w:r>
+        <w:t xml:space="preserve">documents at scale.</w:t>
+      </w:r>
+    </w:p>
+    <w:p>
+      <w:pPr>
+        <w:pStyle w:val="BodyText"/>
+      </w:pPr>
+      <w:r>
+        <w:t xml:space="preserve">This conceptual work is grounded in original data construction already underway.</w:t>
+      </w:r>
+      <w:r>
+        <w:t xml:space="preserve"> </w:t>
+      </w:r>
+      <w:r>
+        <w:t xml:space="preserve">Under the supervision of Professor Xiulan Zhang, I have applied computational</w:t>
+      </w:r>
+      <w:r>
+        <w:t xml:space="preserve"> </w:t>
+      </w:r>
+      <w:r>
+        <w:t xml:space="preserve">methods — including LLM-based document coding and structured information</w:t>
+      </w:r>
+      <w:r>
+        <w:t xml:space="preserve"> </w:t>
+      </w:r>
+      <w:r>
+        <w:t xml:space="preserve">extraction — to build two original databases. The first is a multi-actor</w:t>
+      </w:r>
+      <w:r>
+        <w:t xml:space="preserve"> </w:t>
+      </w:r>
+      <w:r>
+        <w:t xml:space="preserve">coordination database documenting government agency, enterprise, and social</w:t>
+      </w:r>
+      <w:r>
+        <w:t xml:space="preserve"> </w:t>
+      </w:r>
+      <w:r>
+        <w:t xml:space="preserve">organization participation in China’s poverty alleviation governance from 2010 to</w:t>
+      </w:r>
+      <w:r>
+        <w:t xml:space="preserve"> </w:t>
+      </w:r>
+      <w:r>
+        <w:t xml:space="preserve">2023, constructed from policy documents, government reports, and organizational</w:t>
+      </w:r>
+      <w:r>
+        <w:t xml:space="preserve"> </w:t>
+      </w:r>
+      <w:r>
+        <w:t xml:space="preserve">records at national scale. The second is a social organization database comprising</w:t>
+      </w:r>
+      <w:r>
+        <w:t xml:space="preserve"> </w:t>
+      </w:r>
+      <w:r>
+        <w:t xml:space="preserve">over 2,000 organizations, with approximately 26 months of longitudinal data on</w:t>
+      </w:r>
+      <w:r>
+        <w:t xml:space="preserve"> </w:t>
+      </w:r>
+      <w:r>
+        <w:t xml:space="preserve">funding flows and project activity. Together, these datasets constitute an</w:t>
+      </w:r>
+      <w:r>
+        <w:t xml:space="preserve"> </w:t>
+      </w:r>
+      <w:r>
+        <w:t xml:space="preserve">empirical foundation for organizational ecology research on Chinese governance that</w:t>
+      </w:r>
+      <w:r>
+        <w:t xml:space="preserve"> </w:t>
+      </w:r>
+      <w:r>
+        <w:t xml:space="preserve">does not yet exist in the field — and the starting point, not the ceiling, of the</w:t>
+      </w:r>
+      <w:r>
+        <w:t xml:space="preserve"> </w:t>
+      </w:r>
+      <w:r>
+        <w:t xml:space="preserve">data infrastructure required to connect implementation variation to household</w:t>
+      </w:r>
+      <w:r>
+        <w:t xml:space="preserve"> </w:t>
+      </w:r>
+      <w:r>
+        <w:t xml:space="preserve">outcomes.</w:t>
       </w:r>
     </w:p>
     <w:p>
@@ -466,7 +526,7 @@
         <w:t xml:space="preserve"> </w:t>
       </w:r>
       <w:r>
-        <w:t xml:space="preserve">documents and organizational records. I spent a year at Apple’s Intelligence</w:t>
+        <w:t xml:space="preserve">documents and organizational records. I spent almost a year at Apple’s Intelligence</w:t>
       </w:r>
       <w:r>
         <w:t xml:space="preserve"> </w:t>

</xml_diff>

<commit_message>
PS: remove priority claims, deduplicate Apple duration
- Drop "among the first studies" entirely; replace with methodological description
- Opening: remove "almost a year" (duration stated once later is enough)
- Second instance keeps "almost a year" as the one concrete time reference

Co-Authored-By: Claude Sonnet 4.6 <noreply@anthropic.com>
</commit_message>
<xml_diff>
--- a/application/cccw_personal_statement.docx
+++ b/application/cccw_personal_statement.docx
@@ -55,13 +55,7 @@
         <w:t xml:space="preserve"> </w:t>
       </w:r>
       <w:r>
-        <w:t xml:space="preserve">empirical work on Chinese governance — and almost a year of production-grade AI</w:t>
-      </w:r>
-      <w:r>
-        <w:t xml:space="preserve"> </w:t>
-      </w:r>
-      <w:r>
-        <w:t xml:space="preserve">engineering experience at Apple. These are not separate tracks. The computational</w:t>
+        <w:t xml:space="preserve">empirical work on Chinese governance — and production-grade AI engineering experience at Apple. These are not separate tracks. The computational</w:t>
       </w:r>
       <w:r>
         <w:t xml:space="preserve"> </w:t>
@@ -197,19 +191,31 @@
         <w:t xml:space="preserve"> </w:t>
       </w:r>
       <w:r>
-        <w:t xml:space="preserve">over a multi-year horizon. This is among the first studies to apply forward-looking vulnerability measurement to</w:t>
-      </w:r>
-      <w:r>
-        <w:t xml:space="preserve"> </w:t>
-      </w:r>
-      <w:r>
-        <w:t xml:space="preserve">a major CCP governance initiative using a causal identification strategy robust</w:t>
-      </w:r>
-      <w:r>
-        <w:t xml:space="preserve"> </w:t>
-      </w:r>
-      <w:r>
-        <w:t xml:space="preserve">to staggered treatment timing.</w:t>
+        <w:t xml:space="preserve">over a multi-year horizon. Methodologically, the study combines forward-looking</w:t>
+      </w:r>
+      <w:r>
+        <w:t xml:space="preserve"> </w:t>
+      </w:r>
+      <w:r>
+        <w:t xml:space="preserve">vulnerability measurement with a causal identification strategy robust to</w:t>
+      </w:r>
+      <w:r>
+        <w:t xml:space="preserve"> </w:t>
+      </w:r>
+      <w:r>
+        <w:t xml:space="preserve">staggered treatment timing — an approach that allows the analysis to move beyond</w:t>
+      </w:r>
+      <w:r>
+        <w:t xml:space="preserve"> </w:t>
+      </w:r>
+      <w:r>
+        <w:t xml:space="preserve">program take-up effects to ask whether policy exposure reduces households’</w:t>
+      </w:r>
+      <w:r>
+        <w:t xml:space="preserve"> </w:t>
+      </w:r>
+      <w:r>
+        <w:t xml:space="preserve">prospective exposure to downward risk.</w:t>
       </w:r>
     </w:p>
     <w:p>

</xml_diff>

<commit_message>
Merge duplicate Research Experience entries into Postgraduate Research Assistant
Co-Authored-By: Claude Sonnet 4.6 <noreply@anthropic.com>
</commit_message>
<xml_diff>
--- a/application/cccw_personal_statement.docx
+++ b/application/cccw_personal_statement.docx
@@ -342,7 +342,7 @@
         <w:t xml:space="preserve"> </w:t>
       </w:r>
       <w:r>
-        <w:t xml:space="preserve">over 2,000 organizations, with approximately 26 months of longitudinal data on</w:t>
+        <w:t xml:space="preserve">over 2,000 organizations, with over two years of longitudinal data on</w:t>
       </w:r>
       <w:r>
         <w:t xml:space="preserve"> </w:t>
@@ -692,61 +692,121 @@
         <w:pStyle w:val="BodyText"/>
       </w:pPr>
       <w:r>
-        <w:t xml:space="preserve">A second, more exploratory project examines whether and how China’s development</w:t>
-      </w:r>
-      <w:r>
-        <w:t xml:space="preserve"> </w:t>
-      </w:r>
-      <w:r>
-        <w:t xml:space="preserve">governance model — the organizational ecology framework constructed in Project One</w:t>
-      </w:r>
-      <w:r>
-        <w:t xml:space="preserve"> </w:t>
-      </w:r>
-      <w:r>
-        <w:t xml:space="preserve">— travels into ASEAN contexts through South-South cooperation and BRI channels.</w:t>
-      </w:r>
-      <w:r>
-        <w:t xml:space="preserve"> </w:t>
-      </w:r>
-      <w:r>
-        <w:t xml:space="preserve">The scope is deliberately bounded: the goal within the fellowship period is not a</w:t>
-      </w:r>
-      <w:r>
-        <w:t xml:space="preserve"> </w:t>
-      </w:r>
-      <w:r>
-        <w:t xml:space="preserve">fully comparative study but a conceptual mapping of the institutional mechanisms</w:t>
-      </w:r>
-      <w:r>
-        <w:t xml:space="preserve"> </w:t>
-      </w:r>
-      <w:r>
-        <w:t xml:space="preserve">through which Chinese governance knowledge is transmitted internationally, drawing</w:t>
-      </w:r>
-      <w:r>
-        <w:t xml:space="preserve"> </w:t>
-      </w:r>
-      <w:r>
-        <w:t xml:space="preserve">on publicly available policy documents and CCCW’s existing regional research</w:t>
-      </w:r>
-      <w:r>
-        <w:t xml:space="preserve"> </w:t>
-      </w:r>
-      <w:r>
-        <w:t xml:space="preserve">network. This positions the project as groundwork for future comparative research</w:t>
-      </w:r>
-      <w:r>
-        <w:t xml:space="preserve"> </w:t>
-      </w:r>
-      <w:r>
-        <w:t xml:space="preserve">rather than a standalone deliverable, and keeps the primary commitment where the</w:t>
-      </w:r>
-      <w:r>
-        <w:t xml:space="preserve"> </w:t>
-      </w:r>
-      <w:r>
-        <w:t xml:space="preserve">evidence base is strongest: on Project One.</w:t>
+        <w:t xml:space="preserve">A second project extends the organizational ecology framework into China’s</w:t>
+      </w:r>
+      <w:r>
+        <w:t xml:space="preserve"> </w:t>
+      </w:r>
+      <w:r>
+        <w:t xml:space="preserve">international development agenda. China’s Global Development Initiative and</w:t>
+      </w:r>
+      <w:r>
+        <w:t xml:space="preserve"> </w:t>
+      </w:r>
+      <w:r>
+        <w:t xml:space="preserve">South-South cooperation programs now actively promote its domestic poverty</w:t>
+      </w:r>
+      <w:r>
+        <w:t xml:space="preserve"> </w:t>
+      </w:r>
+      <w:r>
+        <w:t xml:space="preserve">governance model — including targeted poverty alleviation — to ASEAN partner</w:t>
+      </w:r>
+      <w:r>
+        <w:t xml:space="preserve"> </w:t>
+      </w:r>
+      <w:r>
+        <w:t xml:space="preserve">states through training programs, bilateral agreements, and BRI project governance</w:t>
+      </w:r>
+      <w:r>
+        <w:t xml:space="preserve"> </w:t>
+      </w:r>
+      <w:r>
+        <w:t xml:space="preserve">structures. Yet systematic evidence of how this promotion actually works is thin,</w:t>
+      </w:r>
+      <w:r>
+        <w:t xml:space="preserve"> </w:t>
+      </w:r>
+      <w:r>
+        <w:t xml:space="preserve">and the field lacks any large-scale documentary analysis of which Chinese state</w:t>
+      </w:r>
+      <w:r>
+        <w:t xml:space="preserve"> </w:t>
+      </w:r>
+      <w:r>
+        <w:t xml:space="preserve">actors drive the process and whether their governance frames are coherent or</w:t>
+      </w:r>
+      <w:r>
+        <w:t xml:space="preserve"> </w:t>
+      </w:r>
+      <w:r>
+        <w:t xml:space="preserve">fragmented across bureaucratic sources. Drawing on public document corpora — MFA</w:t>
+      </w:r>
+      <w:r>
+        <w:t xml:space="preserve"> </w:t>
+      </w:r>
+      <w:r>
+        <w:t xml:space="preserve">readouts, MOFCOM cooperation agreements, GDI training materials, and bilateral</w:t>
+      </w:r>
+      <w:r>
+        <w:t xml:space="preserve"> </w:t>
+      </w:r>
+      <w:r>
+        <w:t xml:space="preserve">agreement texts from Cambodia, Laos, Myanmar, and Vietnam — I will apply</w:t>
+      </w:r>
+      <w:r>
+        <w:t xml:space="preserve"> </w:t>
+      </w:r>
+      <w:r>
+        <w:t xml:space="preserve">LLM-based frame extraction and agency-labeled document classification to map</w:t>
+      </w:r>
+      <w:r>
+        <w:t xml:space="preserve"> </w:t>
+      </w:r>
+      <w:r>
+        <w:t xml:space="preserve">whether and how the organizational logic of China’s domestic poverty governance</w:t>
+      </w:r>
+      <w:r>
+        <w:t xml:space="preserve"> </w:t>
+      </w:r>
+      <w:r>
+        <w:t xml:space="preserve">travels internationally, and where it diverges across bureaucratic actors. This</w:t>
+      </w:r>
+      <w:r>
+        <w:t xml:space="preserve"> </w:t>
+      </w:r>
+      <w:r>
+        <w:t xml:space="preserve">project speaks directly to the field’s central unresolved question — whether China</w:t>
+      </w:r>
+      <w:r>
+        <w:t xml:space="preserve"> </w:t>
+      </w:r>
+      <w:r>
+        <w:t xml:space="preserve">exports governance institutions or merely infrastructure — and produces a</w:t>
+      </w:r>
+      <w:r>
+        <w:t xml:space="preserve"> </w:t>
+      </w:r>
+      <w:r>
+        <w:t xml:space="preserve">methodologically distinctive answer grounded in documentary evidence rather than</w:t>
+      </w:r>
+      <w:r>
+        <w:t xml:space="preserve"> </w:t>
+      </w:r>
+      <w:r>
+        <w:t xml:space="preserve">case inference. CCCW’s regional research network and Hong Kong’s access to both</w:t>
+      </w:r>
+      <w:r>
+        <w:t xml:space="preserve"> </w:t>
+      </w:r>
+      <w:r>
+        <w:t xml:space="preserve">mainland documentary sources and ASEAN policy communities make it the ideal base</w:t>
+      </w:r>
+      <w:r>
+        <w:t xml:space="preserve"> </w:t>
+      </w:r>
+      <w:r>
+        <w:t xml:space="preserve">for this work.</w:t>
       </w:r>
     </w:p>
     <w:p>
@@ -802,7 +862,25 @@
         <w:t xml:space="preserve"> </w:t>
       </w:r>
       <w:r>
-        <w:t xml:space="preserve">I look forward to building on that connection as a member of the CCCW community.</w:t>
+        <w:t xml:space="preserve">I bring to CCCW not only a research program but a functional data infrastructure —</w:t>
+      </w:r>
+      <w:r>
+        <w:t xml:space="preserve"> </w:t>
+      </w:r>
+      <w:r>
+        <w:t xml:space="preserve">two original databases, a replicable computational pipeline, and production-grade</w:t>
+      </w:r>
+      <w:r>
+        <w:t xml:space="preserve"> </w:t>
+      </w:r>
+      <w:r>
+        <w:t xml:space="preserve">AI engineering experience — ready to extend from domestic governance into the</w:t>
+      </w:r>
+      <w:r>
+        <w:t xml:space="preserve"> </w:t>
+      </w:r>
+      <w:r>
+        <w:t xml:space="preserve">international development agenda that defines CCCW’s next research frontier.</w:t>
       </w:r>
     </w:p>
     <w:p>

</xml_diff>